<commit_message>
Render report equations as native Word math
</commit_message>
<xml_diff>
--- a/outputs/documents/01_贝叶斯_FNN_RL_全链路技术报告.docx
+++ b/outputs/documents/01_贝叶斯_FNN_RL_全链路技术报告.docx
@@ -293,7 +293,7 @@
                 <w:color w:val="1F2937"/>
                 <w:sz w:val="18"/>
               </w:rPr>
-              <w:t>2026-08-24</w:t>
+              <w:t>2026-08-25</w:t>
             </w:r>
           </w:p>
         </w:tc>
@@ -407,6 +407,594 @@
     </w:p>
     <w:p>
       <w:pPr>
+        <w:spacing w:after="40"/>
+        <w:jc w:val="center"/>
+      </w:pPr>
+      <w:r>
+        <w:rPr>
+          <w:rFonts w:ascii="Microsoft YaHei" w:hAnsi="Microsoft YaHei" w:eastAsia="Microsoft YaHei"/>
+          <w:b w:val="0"/>
+          <w:i/>
+          <w:color w:val="667085"/>
+          <w:sz w:val="21"/>
+        </w:rPr>
+        <w:t>室内空气能量平衡方程</w:t>
+      </w:r>
+    </w:p>
+    <w:p>
+      <w:pPr>
+        <w:spacing w:before="60" w:after="160"/>
+        <w:jc w:val="center"/>
+      </w:pPr>
+      <m:oMathPara>
+        <m:oMath>
+          <m:sSub>
+            <m:e>
+              <m:r>
+                <m:rPr>
+                  <m:sty m:val="p"/>
+                </m:rPr>
+                <m:t xml:space="preserve">C</m:t>
+              </m:r>
+            </m:e>
+            <m:sub>
+              <m:r>
+                <m:rPr>
+                  <m:sty m:val="p"/>
+                </m:rPr>
+                <m:t xml:space="preserve">z</m:t>
+              </m:r>
+            </m:sub>
+          </m:sSub>
+          <m:r>
+            <m:rPr>
+              <m:sty m:val="p"/>
+            </m:rPr>
+            <m:t xml:space="preserve">·</m:t>
+          </m:r>
+          <m:f>
+            <m:num>
+              <m:r>
+                <m:rPr>
+                  <m:sty m:val="p"/>
+                </m:rPr>
+                <m:t xml:space="preserve">d</m:t>
+              </m:r>
+              <m:sSub>
+                <m:e>
+                  <m:r>
+                    <m:rPr>
+                      <m:sty m:val="p"/>
+                    </m:rPr>
+                    <m:t xml:space="preserve">T</m:t>
+                  </m:r>
+                </m:e>
+                <m:sub>
+                  <m:r>
+                    <m:rPr>
+                      <m:sty m:val="p"/>
+                    </m:rPr>
+                    <m:t xml:space="preserve">z</m:t>
+                  </m:r>
+                </m:sub>
+              </m:sSub>
+            </m:num>
+            <m:den>
+              <m:r>
+                <m:rPr>
+                  <m:sty m:val="p"/>
+                </m:rPr>
+                <m:t xml:space="preserve">dt</m:t>
+              </m:r>
+            </m:den>
+          </m:f>
+          <m:r>
+            <m:rPr>
+              <m:sty m:val="p"/>
+            </m:rPr>
+            <m:t xml:space="preserve"> = </m:t>
+          </m:r>
+          <m:f>
+            <m:num>
+              <m:sSub>
+                <m:e>
+                  <m:r>
+                    <m:rPr>
+                      <m:sty m:val="p"/>
+                    </m:rPr>
+                    <m:t xml:space="preserve">T</m:t>
+                  </m:r>
+                </m:e>
+                <m:sub>
+                  <m:r>
+                    <m:rPr>
+                      <m:sty m:val="p"/>
+                    </m:rPr>
+                    <m:t xml:space="preserve">o</m:t>
+                  </m:r>
+                </m:sub>
+              </m:sSub>
+              <m:r>
+                <m:rPr>
+                  <m:sty m:val="p"/>
+                </m:rPr>
+                <m:t xml:space="preserve">−</m:t>
+              </m:r>
+              <m:sSub>
+                <m:e>
+                  <m:r>
+                    <m:rPr>
+                      <m:sty m:val="p"/>
+                    </m:rPr>
+                    <m:t xml:space="preserve">T</m:t>
+                  </m:r>
+                </m:e>
+                <m:sub>
+                  <m:r>
+                    <m:rPr>
+                      <m:sty m:val="p"/>
+                    </m:rPr>
+                    <m:t xml:space="preserve">z</m:t>
+                  </m:r>
+                </m:sub>
+              </m:sSub>
+            </m:num>
+            <m:den>
+              <m:sSub>
+                <m:e>
+                  <m:r>
+                    <m:rPr>
+                      <m:sty m:val="p"/>
+                    </m:rPr>
+                    <m:t xml:space="preserve">R</m:t>
+                  </m:r>
+                </m:e>
+                <m:sub>
+                  <m:r>
+                    <m:rPr>
+                      <m:sty m:val="p"/>
+                    </m:rPr>
+                    <m:t xml:space="preserve">oz</m:t>
+                  </m:r>
+                </m:sub>
+              </m:sSub>
+            </m:den>
+          </m:f>
+          <m:r>
+            <m:rPr>
+              <m:sty m:val="p"/>
+            </m:rPr>
+            <m:t xml:space="preserve"> + </m:t>
+          </m:r>
+          <m:f>
+            <m:num>
+              <m:sSub>
+                <m:e>
+                  <m:r>
+                    <m:rPr>
+                      <m:sty m:val="p"/>
+                    </m:rPr>
+                    <m:t xml:space="preserve">T</m:t>
+                  </m:r>
+                </m:e>
+                <m:sub>
+                  <m:r>
+                    <m:rPr>
+                      <m:sty m:val="p"/>
+                    </m:rPr>
+                    <m:t xml:space="preserve">w</m:t>
+                  </m:r>
+                </m:sub>
+              </m:sSub>
+              <m:r>
+                <m:rPr>
+                  <m:sty m:val="p"/>
+                </m:rPr>
+                <m:t xml:space="preserve">−</m:t>
+              </m:r>
+              <m:sSub>
+                <m:e>
+                  <m:r>
+                    <m:rPr>
+                      <m:sty m:val="p"/>
+                    </m:rPr>
+                    <m:t xml:space="preserve">T</m:t>
+                  </m:r>
+                </m:e>
+                <m:sub>
+                  <m:r>
+                    <m:rPr>
+                      <m:sty m:val="p"/>
+                    </m:rPr>
+                    <m:t xml:space="preserve">z</m:t>
+                  </m:r>
+                </m:sub>
+              </m:sSub>
+            </m:num>
+            <m:den>
+              <m:sSub>
+                <m:e>
+                  <m:r>
+                    <m:rPr>
+                      <m:sty m:val="p"/>
+                    </m:rPr>
+                    <m:t xml:space="preserve">R</m:t>
+                  </m:r>
+                </m:e>
+                <m:sub>
+                  <m:r>
+                    <m:rPr>
+                      <m:sty m:val="p"/>
+                    </m:rPr>
+                    <m:t xml:space="preserve">zw</m:t>
+                  </m:r>
+                </m:sub>
+              </m:sSub>
+            </m:den>
+          </m:f>
+          <m:r>
+            <m:rPr>
+              <m:sty m:val="p"/>
+            </m:rPr>
+            <m:t xml:space="preserve"> + </m:t>
+          </m:r>
+          <m:sSub>
+            <m:e>
+              <m:r>
+                <m:rPr>
+                  <m:sty m:val="p"/>
+                </m:rPr>
+                <m:t xml:space="preserve">Q</m:t>
+              </m:r>
+            </m:e>
+            <m:sub>
+              <m:r>
+                <m:rPr>
+                  <m:sty m:val="p"/>
+                </m:rPr>
+                <m:t xml:space="preserve">int</m:t>
+              </m:r>
+            </m:sub>
+          </m:sSub>
+          <m:r>
+            <m:rPr>
+              <m:sty m:val="p"/>
+            </m:rPr>
+            <m:t xml:space="preserve"> − </m:t>
+          </m:r>
+          <m:sSub>
+            <m:e>
+              <m:r>
+                <m:rPr>
+                  <m:sty m:val="p"/>
+                </m:rPr>
+                <m:t xml:space="preserve">Q</m:t>
+              </m:r>
+            </m:e>
+            <m:sub>
+              <m:r>
+                <m:rPr>
+                  <m:sty m:val="p"/>
+                </m:rPr>
+                <m:t xml:space="preserve">cool</m:t>
+              </m:r>
+            </m:sub>
+          </m:sSub>
+        </m:oMath>
+      </m:oMathPara>
+    </w:p>
+    <w:p>
+      <w:pPr>
+        <w:spacing w:after="40"/>
+        <w:jc w:val="center"/>
+      </w:pPr>
+      <w:r>
+        <w:rPr>
+          <w:rFonts w:ascii="Microsoft YaHei" w:hAnsi="Microsoft YaHei" w:eastAsia="Microsoft YaHei"/>
+          <w:b w:val="0"/>
+          <w:i/>
+          <w:color w:val="667085"/>
+          <w:sz w:val="21"/>
+        </w:rPr>
+        <w:t>墙体/机柜能量平衡方程</w:t>
+      </w:r>
+    </w:p>
+    <w:p>
+      <w:pPr>
+        <w:spacing w:before="60" w:after="160"/>
+        <w:jc w:val="center"/>
+      </w:pPr>
+      <m:oMathPara>
+        <m:oMath>
+          <m:sSub>
+            <m:e>
+              <m:r>
+                <m:rPr>
+                  <m:sty m:val="p"/>
+                </m:rPr>
+                <m:t xml:space="preserve">C</m:t>
+              </m:r>
+            </m:e>
+            <m:sub>
+              <m:r>
+                <m:rPr>
+                  <m:sty m:val="p"/>
+                </m:rPr>
+                <m:t xml:space="preserve">w</m:t>
+              </m:r>
+            </m:sub>
+          </m:sSub>
+          <m:r>
+            <m:rPr>
+              <m:sty m:val="p"/>
+            </m:rPr>
+            <m:t xml:space="preserve">·</m:t>
+          </m:r>
+          <m:f>
+            <m:num>
+              <m:r>
+                <m:rPr>
+                  <m:sty m:val="p"/>
+                </m:rPr>
+                <m:t xml:space="preserve">d</m:t>
+              </m:r>
+              <m:sSub>
+                <m:e>
+                  <m:r>
+                    <m:rPr>
+                      <m:sty m:val="p"/>
+                    </m:rPr>
+                    <m:t xml:space="preserve">T</m:t>
+                  </m:r>
+                </m:e>
+                <m:sub>
+                  <m:r>
+                    <m:rPr>
+                      <m:sty m:val="p"/>
+                    </m:rPr>
+                    <m:t xml:space="preserve">w</m:t>
+                  </m:r>
+                </m:sub>
+              </m:sSub>
+            </m:num>
+            <m:den>
+              <m:r>
+                <m:rPr>
+                  <m:sty m:val="p"/>
+                </m:rPr>
+                <m:t xml:space="preserve">dt</m:t>
+              </m:r>
+            </m:den>
+          </m:f>
+          <m:r>
+            <m:rPr>
+              <m:sty m:val="p"/>
+            </m:rPr>
+            <m:t xml:space="preserve"> = </m:t>
+          </m:r>
+          <m:f>
+            <m:num>
+              <m:sSub>
+                <m:e>
+                  <m:r>
+                    <m:rPr>
+                      <m:sty m:val="p"/>
+                    </m:rPr>
+                    <m:t xml:space="preserve">T</m:t>
+                  </m:r>
+                </m:e>
+                <m:sub>
+                  <m:r>
+                    <m:rPr>
+                      <m:sty m:val="p"/>
+                    </m:rPr>
+                    <m:t xml:space="preserve">o</m:t>
+                  </m:r>
+                </m:sub>
+              </m:sSub>
+              <m:r>
+                <m:rPr>
+                  <m:sty m:val="p"/>
+                </m:rPr>
+                <m:t xml:space="preserve">−</m:t>
+              </m:r>
+              <m:sSub>
+                <m:e>
+                  <m:r>
+                    <m:rPr>
+                      <m:sty m:val="p"/>
+                    </m:rPr>
+                    <m:t xml:space="preserve">T</m:t>
+                  </m:r>
+                </m:e>
+                <m:sub>
+                  <m:r>
+                    <m:rPr>
+                      <m:sty m:val="p"/>
+                    </m:rPr>
+                    <m:t xml:space="preserve">w</m:t>
+                  </m:r>
+                </m:sub>
+              </m:sSub>
+            </m:num>
+            <m:den>
+              <m:sSub>
+                <m:e>
+                  <m:r>
+                    <m:rPr>
+                      <m:sty m:val="p"/>
+                    </m:rPr>
+                    <m:t xml:space="preserve">R</m:t>
+                  </m:r>
+                </m:e>
+                <m:sub>
+                  <m:r>
+                    <m:rPr>
+                      <m:sty m:val="p"/>
+                    </m:rPr>
+                    <m:t xml:space="preserve">ow</m:t>
+                  </m:r>
+                </m:sub>
+              </m:sSub>
+            </m:den>
+          </m:f>
+          <m:r>
+            <m:rPr>
+              <m:sty m:val="p"/>
+            </m:rPr>
+            <m:t xml:space="preserve"> + </m:t>
+          </m:r>
+          <m:f>
+            <m:num>
+              <m:sSub>
+                <m:e>
+                  <m:r>
+                    <m:rPr>
+                      <m:sty m:val="p"/>
+                    </m:rPr>
+                    <m:t xml:space="preserve">T</m:t>
+                  </m:r>
+                </m:e>
+                <m:sub>
+                  <m:r>
+                    <m:rPr>
+                      <m:sty m:val="p"/>
+                    </m:rPr>
+                    <m:t xml:space="preserve">z</m:t>
+                  </m:r>
+                </m:sub>
+              </m:sSub>
+              <m:r>
+                <m:rPr>
+                  <m:sty m:val="p"/>
+                </m:rPr>
+                <m:t xml:space="preserve">−</m:t>
+              </m:r>
+              <m:sSub>
+                <m:e>
+                  <m:r>
+                    <m:rPr>
+                      <m:sty m:val="p"/>
+                    </m:rPr>
+                    <m:t xml:space="preserve">T</m:t>
+                  </m:r>
+                </m:e>
+                <m:sub>
+                  <m:r>
+                    <m:rPr>
+                      <m:sty m:val="p"/>
+                    </m:rPr>
+                    <m:t xml:space="preserve">w</m:t>
+                  </m:r>
+                </m:sub>
+              </m:sSub>
+            </m:num>
+            <m:den>
+              <m:sSub>
+                <m:e>
+                  <m:r>
+                    <m:rPr>
+                      <m:sty m:val="p"/>
+                    </m:rPr>
+                    <m:t xml:space="preserve">R</m:t>
+                  </m:r>
+                </m:e>
+                <m:sub>
+                  <m:r>
+                    <m:rPr>
+                      <m:sty m:val="p"/>
+                    </m:rPr>
+                    <m:t xml:space="preserve">zw</m:t>
+                  </m:r>
+                </m:sub>
+              </m:sSub>
+            </m:den>
+          </m:f>
+        </m:oMath>
+      </m:oMathPara>
+    </w:p>
+    <w:p>
+      <w:pPr>
+        <w:spacing w:after="40"/>
+        <w:jc w:val="center"/>
+      </w:pPr>
+      <w:r>
+        <w:rPr>
+          <w:rFonts w:ascii="Microsoft YaHei" w:hAnsi="Microsoft YaHei" w:eastAsia="Microsoft YaHei"/>
+          <w:b w:val="0"/>
+          <w:i/>
+          <w:color w:val="667085"/>
+          <w:sz w:val="21"/>
+        </w:rPr>
+        <w:t>制冷量与执行器状态</w:t>
+      </w:r>
+    </w:p>
+    <w:p>
+      <w:pPr>
+        <w:spacing w:before="60" w:after="160"/>
+        <w:jc w:val="center"/>
+      </w:pPr>
+      <m:oMathPara>
+        <m:oMath>
+          <m:sSub>
+            <m:e>
+              <m:r>
+                <m:rPr>
+                  <m:sty m:val="p"/>
+                </m:rPr>
+                <m:t xml:space="preserve">Q</m:t>
+              </m:r>
+            </m:e>
+            <m:sub>
+              <m:r>
+                <m:rPr>
+                  <m:sty m:val="p"/>
+                </m:rPr>
+                <m:t xml:space="preserve">cool</m:t>
+              </m:r>
+            </m:sub>
+          </m:sSub>
+          <m:r>
+            <m:rPr>
+              <m:sty m:val="p"/>
+            </m:rPr>
+            <m:t xml:space="preserve"> = actuator(</m:t>
+          </m:r>
+          <m:r>
+            <m:rPr>
+              <m:sty m:val="p"/>
+            </m:rPr>
+            <m:t xml:space="preserve">u</m:t>
+          </m:r>
+          <m:r>
+            <m:rPr>
+              <m:sty m:val="p"/>
+            </m:rPr>
+            <m:t xml:space="preserve">)·</m:t>
+          </m:r>
+          <m:sSub>
+            <m:e>
+              <m:r>
+                <m:rPr>
+                  <m:sty m:val="p"/>
+                </m:rPr>
+                <m:t xml:space="preserve">Q</m:t>
+              </m:r>
+            </m:e>
+            <m:sub>
+              <m:r>
+                <m:rPr>
+                  <m:sty m:val="p"/>
+                </m:rPr>
+                <m:t xml:space="preserve">max</m:t>
+              </m:r>
+            </m:sub>
+          </m:sSub>
+        </m:oMath>
+      </m:oMathPara>
+    </w:p>
+    <w:p>
+      <w:pPr>
         <w:spacing w:after="60"/>
         <w:jc w:val="center"/>
       </w:pPr>
@@ -418,7 +1006,7 @@
           <w:color w:val="667085"/>
           <w:sz w:val="21"/>
         </w:rPr>
-        <w:t>3R2C 与 ThermalPlant3R2C.step() 的对应方程</w:t>
+        <w:t>ThermalPlant3R2C.step() 中的执行器实现</w:t>
       </w:r>
     </w:p>
     <w:tbl>
@@ -458,46 +1046,7 @@
                 <w:color w:val="263238"/>
                 <w:sz w:val="16"/>
               </w:rPr>
-              <w:t>Cz*dTz/dt = (To-Tz)/Roz + (Tw-Tz)/Rzw + Qint - Qcool</w:t>
-            </w:r>
-            <w:r>
-              <w:br/>
-            </w:r>
-            <w:r>
-              <w:rPr>
-                <w:rFonts w:ascii="Consolas" w:hAnsi="Consolas" w:eastAsia="Consolas"/>
-                <w:b w:val="0"/>
-                <w:i w:val="0"/>
-                <w:color w:val="263238"/>
-                <w:sz w:val="16"/>
-              </w:rPr>
-              <w:t>Cw*dTw/dt = (To-Tw)/Row + (Tz-Tw)/Rzw</w:t>
-            </w:r>
-            <w:r>
-              <w:br/>
-            </w:r>
-            <w:r>
-              <w:rPr>
-                <w:rFonts w:ascii="Consolas" w:hAnsi="Consolas" w:eastAsia="Consolas"/>
-                <w:b w:val="0"/>
-                <w:i w:val="0"/>
-                <w:color w:val="263238"/>
-                <w:sz w:val="16"/>
-              </w:rPr>
-              <w:t>Qcool = actuator(u) * Qmax</w:t>
-            </w:r>
-            <w:r>
-              <w:br/>
-            </w:r>
-            <w:r>
-              <w:rPr>
-                <w:rFonts w:ascii="Consolas" w:hAnsi="Consolas" w:eastAsia="Consolas"/>
-                <w:b w:val="0"/>
-                <w:i w:val="0"/>
-                <w:color w:val="263238"/>
-                <w:sz w:val="16"/>
-              </w:rPr>
-              <w:t>actuator = 5 min dead time + 4 min first-order lag</w:t>
+              <w:t># 离散实现：5 min dead time + 4 min first-order lag</w:t>
             </w:r>
           </w:p>
         </w:tc>
@@ -1831,6 +2380,146 @@
       </w:pPr>
     </w:p>
     <w:p>
+      <w:pPr>
+        <w:spacing w:after="40"/>
+        <w:jc w:val="center"/>
+      </w:pPr>
+      <w:r>
+        <w:rPr>
+          <w:rFonts w:ascii="Microsoft YaHei" w:hAnsi="Microsoft YaHei" w:eastAsia="Microsoft YaHei"/>
+          <w:b w:val="0"/>
+          <w:i/>
+          <w:color w:val="667085"/>
+          <w:sz w:val="21"/>
+        </w:rPr>
+        <w:t>并联 PI 控制律</w:t>
+      </w:r>
+    </w:p>
+    <w:p>
+      <w:pPr>
+        <w:spacing w:before="60" w:after="160"/>
+        <w:jc w:val="center"/>
+      </w:pPr>
+      <m:oMathPara>
+        <m:oMath>
+          <m:sSub>
+            <m:e>
+              <m:r>
+                <m:rPr>
+                  <m:sty m:val="p"/>
+                </m:rPr>
+                <m:t xml:space="preserve">u</m:t>
+              </m:r>
+            </m:e>
+            <m:sub>
+              <m:r>
+                <m:rPr>
+                  <m:sty m:val="p"/>
+                </m:rPr>
+                <m:t xml:space="preserve">raw</m:t>
+              </m:r>
+            </m:sub>
+          </m:sSub>
+          <m:r>
+            <m:rPr>
+              <m:sty m:val="p"/>
+            </m:rPr>
+            <m:t xml:space="preserve"> = </m:t>
+          </m:r>
+          <m:sSub>
+            <m:e>
+              <m:r>
+                <m:rPr>
+                  <m:sty m:val="p"/>
+                </m:rPr>
+                <m:t xml:space="preserve">K</m:t>
+              </m:r>
+            </m:e>
+            <m:sub>
+              <m:r>
+                <m:rPr>
+                  <m:sty m:val="p"/>
+                </m:rPr>
+                <m:t xml:space="preserve">p</m:t>
+              </m:r>
+            </m:sub>
+          </m:sSub>
+          <m:r>
+            <m:rPr>
+              <m:sty m:val="p"/>
+            </m:rPr>
+            <m:t xml:space="preserve">·e + </m:t>
+          </m:r>
+          <m:sSub>
+            <m:e>
+              <m:r>
+                <m:rPr>
+                  <m:sty m:val="p"/>
+                </m:rPr>
+                <m:t xml:space="preserve">K</m:t>
+              </m:r>
+            </m:e>
+            <m:sub>
+              <m:r>
+                <m:rPr>
+                  <m:sty m:val="p"/>
+                </m:rPr>
+                <m:t xml:space="preserve">i</m:t>
+              </m:r>
+            </m:sub>
+          </m:sSub>
+          <m:r>
+            <m:rPr>
+              <m:sty m:val="p"/>
+            </m:rPr>
+            <m:t xml:space="preserve">·</m:t>
+          </m:r>
+          <m:r>
+            <m:rPr>
+              <m:sty m:val="p"/>
+            </m:rPr>
+            <m:t xml:space="preserve">∫</m:t>
+          </m:r>
+          <m:r>
+            <m:rPr>
+              <m:sty m:val="p"/>
+            </m:rPr>
+            <m:t xml:space="preserve">e dt</m:t>
+          </m:r>
+          <m:r>
+            <m:rPr>
+              <m:sty m:val="p"/>
+            </m:rPr>
+            <m:t xml:space="preserve">；  u = clip(</m:t>
+          </m:r>
+          <m:sSub>
+            <m:e>
+              <m:r>
+                <m:rPr>
+                  <m:sty m:val="p"/>
+                </m:rPr>
+                <m:t xml:space="preserve">u</m:t>
+              </m:r>
+            </m:e>
+            <m:sub>
+              <m:r>
+                <m:rPr>
+                  <m:sty m:val="p"/>
+                </m:rPr>
+                <m:t xml:space="preserve">raw</m:t>
+              </m:r>
+            </m:sub>
+          </m:sSub>
+          <m:r>
+            <m:rPr>
+              <m:sty m:val="p"/>
+            </m:rPr>
+            <m:t xml:space="preserve">, 0, 1)</m:t>
+          </m:r>
+        </m:oMath>
+      </m:oMathPara>
+    </w:p>
+    <w:p>
       <w:r>
         <w:rPr>
           <w:rFonts w:ascii="Microsoft YaHei" w:hAnsi="Microsoft YaHei" w:eastAsia="Microsoft YaHei"/>
@@ -1839,7 +2528,7 @@
           <w:color w:val="1F2937"/>
           <w:sz w:val="21"/>
         </w:rPr>
-        <w:t>PI 公式：u_raw=Kp*e+Ki*积分(e)；u=clip(u_raw,0,1)。积分采用条件抗饱和：输出饱和且误差仍把输出推向边界时停止积分。</w:t>
+        <w:t>积分采用条件抗饱和：输出饱和且误差仍把输出推向边界时停止积分。</w:t>
       </w:r>
     </w:p>
     <w:p>
@@ -2271,7 +2960,7 @@
     </w:p>
     <w:p>
       <w:pPr>
-        <w:spacing w:after="60"/>
+        <w:spacing w:after="40"/>
         <w:jc w:val="center"/>
       </w:pPr>
       <w:r>
@@ -2282,82 +2971,214 @@
           <w:color w:val="667085"/>
           <w:sz w:val="21"/>
         </w:rPr>
-        <w:t>FOPDT 代理公式</w:t>
+        <w:t>FOPDT 传递函数</w:t>
       </w:r>
     </w:p>
-    <w:tbl>
-      <w:tblPr>
-        <w:tblW w:type="dxa" w:w="9360"/>
-        <w:tblLayout w:type="fixed"/>
-        <w:tblLook w:firstColumn="1" w:firstRow="1" w:lastColumn="0" w:lastRow="0" w:noHBand="0" w:noVBand="1" w:val="04A0"/>
-        <w:jc w:val="left"/>
-        <w:tblInd w:w="120" w:type="dxa"/>
-      </w:tblPr>
-      <w:tblGrid>
-        <w:gridCol w:w="9360"/>
-      </w:tblGrid>
-      <w:tr>
-        <w:tc>
-          <w:tcPr>
-            <w:tcW w:type="dxa" w:w="9360"/>
-            <w:tcMar>
-              <w:top w:w="80" w:type="dxa"/>
-              <w:start w:w="120" w:type="dxa"/>
-              <w:bottom w:w="80" w:type="dxa"/>
-              <w:end w:w="120" w:type="dxa"/>
-            </w:tcMar>
-            <w:vAlign w:val="center"/>
-            <w:shd w:fill="F7F8FA"/>
-          </w:tcPr>
-          <w:p>
-            <w:pPr>
-              <w:spacing w:after="0" w:line="240" w:lineRule="auto"/>
-            </w:pPr>
-            <w:r/>
-            <w:r>
-              <w:rPr>
-                <w:rFonts w:ascii="Consolas" w:hAnsi="Consolas" w:eastAsia="Consolas"/>
-                <w:b w:val="0"/>
-                <w:i w:val="0"/>
-                <w:color w:val="263238"/>
-                <w:sz w:val="16"/>
-              </w:rPr>
-              <w:t>G(s) = -K*exp(-L*s)/(tau*s+1)</w:t>
-            </w:r>
-            <w:r>
-              <w:br/>
-            </w:r>
-            <w:r>
-              <w:rPr>
-                <w:rFonts w:ascii="Consolas" w:hAnsi="Consolas" w:eastAsia="Consolas"/>
-                <w:b w:val="0"/>
-                <w:i w:val="0"/>
-                <w:color w:val="263238"/>
-                <w:sz w:val="16"/>
-              </w:rPr>
-              <w:t>T_hat(t)=T0-A*(1-exp(-(t-L)/tau)), t&gt;L</w:t>
-            </w:r>
-            <w:r>
-              <w:br/>
-            </w:r>
-            <w:r>
-              <w:rPr>
-                <w:rFonts w:ascii="Consolas" w:hAnsi="Consolas" w:eastAsia="Consolas"/>
-                <w:b w:val="0"/>
-                <w:i w:val="0"/>
-                <w:color w:val="263238"/>
-                <w:sz w:val="16"/>
-              </w:rPr>
-              <w:t>K=A/delta_u</w:t>
-            </w:r>
-          </w:p>
-        </w:tc>
-      </w:tr>
-    </w:tbl>
+    <w:p>
+      <w:pPr>
+        <w:spacing w:before="60" w:after="160"/>
+        <w:jc w:val="center"/>
+      </w:pPr>
+      <m:oMathPara>
+        <m:oMath>
+          <m:r>
+            <m:rPr>
+              <m:sty m:val="p"/>
+            </m:rPr>
+            <m:t xml:space="preserve">G(s) = −</m:t>
+          </m:r>
+          <m:f>
+            <m:num>
+              <m:r>
+                <m:rPr>
+                  <m:sty m:val="p"/>
+                </m:rPr>
+                <m:t xml:space="preserve">K·</m:t>
+              </m:r>
+              <m:sSup>
+                <m:e>
+                  <m:r>
+                    <m:rPr>
+                      <m:sty m:val="p"/>
+                    </m:rPr>
+                    <m:t xml:space="preserve">e</m:t>
+                  </m:r>
+                </m:e>
+                <m:sup>
+                  <m:r>
+                    <m:rPr>
+                      <m:sty m:val="p"/>
+                    </m:rPr>
+                    <m:t xml:space="preserve">−Ls</m:t>
+                  </m:r>
+                </m:sup>
+              </m:sSup>
+            </m:num>
+            <m:den>
+              <m:r>
+                <m:rPr>
+                  <m:sty m:val="p"/>
+                </m:rPr>
+                <m:t xml:space="preserve">τs + 1</m:t>
+              </m:r>
+            </m:den>
+          </m:f>
+        </m:oMath>
+      </m:oMathPara>
+    </w:p>
     <w:p>
       <w:pPr>
         <w:spacing w:after="40"/>
+        <w:jc w:val="center"/>
       </w:pPr>
+      <w:r>
+        <w:rPr>
+          <w:rFonts w:ascii="Microsoft YaHei" w:hAnsi="Microsoft YaHei" w:eastAsia="Microsoft YaHei"/>
+          <w:b w:val="0"/>
+          <w:i/>
+          <w:color w:val="667085"/>
+          <w:sz w:val="21"/>
+        </w:rPr>
+        <w:t>FOPDT 阶跃响应</w:t>
+      </w:r>
+    </w:p>
+    <w:p>
+      <w:pPr>
+        <w:spacing w:before="60" w:after="160"/>
+        <w:jc w:val="center"/>
+      </w:pPr>
+      <m:oMathPara>
+        <m:oMath>
+          <m:sSub>
+            <m:e>
+              <m:r>
+                <m:rPr>
+                  <m:sty m:val="p"/>
+                </m:rPr>
+                <m:t xml:space="preserve">T</m:t>
+              </m:r>
+            </m:e>
+            <m:sub>
+              <m:r>
+                <m:rPr>
+                  <m:sty m:val="p"/>
+                </m:rPr>
+                <m:t xml:space="preserve">hat</m:t>
+              </m:r>
+            </m:sub>
+          </m:sSub>
+          <m:r>
+            <m:rPr>
+              <m:sty m:val="p"/>
+            </m:rPr>
+            <m:t xml:space="preserve">(t) = </m:t>
+          </m:r>
+          <m:sSub>
+            <m:e>
+              <m:r>
+                <m:rPr>
+                  <m:sty m:val="p"/>
+                </m:rPr>
+                <m:t xml:space="preserve">T</m:t>
+              </m:r>
+            </m:e>
+            <m:sub>
+              <m:r>
+                <m:rPr>
+                  <m:sty m:val="p"/>
+                </m:rPr>
+                <m:t xml:space="preserve">0</m:t>
+              </m:r>
+            </m:sub>
+          </m:sSub>
+          <m:r>
+            <m:rPr>
+              <m:sty m:val="p"/>
+            </m:rPr>
+            <m:t xml:space="preserve"> − A[1 − </m:t>
+          </m:r>
+          <m:sSup>
+            <m:e>
+              <m:r>
+                <m:rPr>
+                  <m:sty m:val="p"/>
+                </m:rPr>
+                <m:t xml:space="preserve">e</m:t>
+              </m:r>
+            </m:e>
+            <m:sup>
+              <m:r>
+                <m:rPr>
+                  <m:sty m:val="p"/>
+                </m:rPr>
+                <m:t xml:space="preserve">−(t−L)/τ</m:t>
+              </m:r>
+            </m:sup>
+          </m:sSup>
+          <m:r>
+            <m:rPr>
+              <m:sty m:val="p"/>
+            </m:rPr>
+            <m:t xml:space="preserve">]，  t &gt; L</m:t>
+          </m:r>
+        </m:oMath>
+      </m:oMathPara>
+    </w:p>
+    <w:p>
+      <w:pPr>
+        <w:spacing w:after="40"/>
+        <w:jc w:val="center"/>
+      </w:pPr>
+      <w:r>
+        <w:rPr>
+          <w:rFonts w:ascii="Microsoft YaHei" w:hAnsi="Microsoft YaHei" w:eastAsia="Microsoft YaHei"/>
+          <w:b w:val="0"/>
+          <w:i/>
+          <w:color w:val="667085"/>
+          <w:sz w:val="21"/>
+        </w:rPr>
+        <w:t>过程增益</w:t>
+      </w:r>
+    </w:p>
+    <w:p>
+      <w:pPr>
+        <w:spacing w:before="60" w:after="160"/>
+        <w:jc w:val="center"/>
+      </w:pPr>
+      <m:oMathPara>
+        <m:oMath>
+          <m:r>
+            <m:rPr>
+              <m:sty m:val="p"/>
+            </m:rPr>
+            <m:t xml:space="preserve">K = </m:t>
+          </m:r>
+          <m:f>
+            <m:num>
+              <m:r>
+                <m:rPr>
+                  <m:sty m:val="p"/>
+                </m:rPr>
+                <m:t xml:space="preserve">A</m:t>
+              </m:r>
+            </m:num>
+            <m:den>
+              <m:r>
+                <m:rPr>
+                  <m:sty m:val="p"/>
+                </m:rPr>
+                <m:t xml:space="preserve">Δ</m:t>
+              </m:r>
+              <m:r>
+                <m:rPr>
+                  <m:sty m:val="p"/>
+                </m:rPr>
+                <m:t xml:space="preserve">u</m:t>
+              </m:r>
+            </m:den>
+          </m:f>
+        </m:oMath>
+      </m:oMathPara>
     </w:p>
     <w:tbl>
       <w:tblPr>
@@ -2924,6 +3745,520 @@
       <w:pPr>
         <w:spacing w:after="40"/>
       </w:pPr>
+    </w:p>
+    <w:p>
+      <w:pPr>
+        <w:pStyle w:val="Heading2"/>
+      </w:pPr>
+      <w:r>
+        <w:t>1.5 由 FOPDT 得到 Z-N 与 IMC 的 Kp、Ki</w:t>
+      </w:r>
+    </w:p>
+    <w:p>
+      <w:pPr>
+        <w:spacing w:after="40"/>
+        <w:jc w:val="center"/>
+      </w:pPr>
+      <w:r>
+        <w:rPr>
+          <w:rFonts w:ascii="Microsoft YaHei" w:hAnsi="Microsoft YaHei" w:eastAsia="Microsoft YaHei"/>
+          <w:b w:val="0"/>
+          <w:i/>
+          <w:color w:val="667085"/>
+          <w:sz w:val="21"/>
+        </w:rPr>
+        <w:t>Ziegler-Nichols 比例增益</w:t>
+      </w:r>
+    </w:p>
+    <w:p>
+      <w:pPr>
+        <w:spacing w:before="60" w:after="160"/>
+        <w:jc w:val="center"/>
+      </w:pPr>
+      <m:oMathPara>
+        <m:oMath>
+          <m:sSup>
+            <m:e>
+              <m:sSub>
+                <m:e>
+                  <m:r>
+                    <m:rPr>
+                      <m:sty m:val="p"/>
+                    </m:rPr>
+                    <m:t xml:space="preserve">K</m:t>
+                  </m:r>
+                </m:e>
+                <m:sub>
+                  <m:r>
+                    <m:rPr>
+                      <m:sty m:val="p"/>
+                    </m:rPr>
+                    <m:t xml:space="preserve">p</m:t>
+                  </m:r>
+                </m:sub>
+              </m:sSub>
+            </m:e>
+            <m:sup>
+              <m:r>
+                <m:rPr>
+                  <m:sty m:val="p"/>
+                </m:rPr>
+                <m:t xml:space="preserve">ZN</m:t>
+              </m:r>
+            </m:sup>
+          </m:sSup>
+          <m:r>
+            <m:rPr>
+              <m:sty m:val="p"/>
+            </m:rPr>
+            <m:t xml:space="preserve"> = 0.9</m:t>
+          </m:r>
+          <m:f>
+            <m:num>
+              <m:r>
+                <m:rPr>
+                  <m:sty m:val="p"/>
+                </m:rPr>
+                <m:t xml:space="preserve">τ</m:t>
+              </m:r>
+            </m:num>
+            <m:den>
+              <m:r>
+                <m:rPr>
+                  <m:sty m:val="p"/>
+                </m:rPr>
+                <m:t xml:space="preserve">K</m:t>
+              </m:r>
+              <m:r>
+                <m:rPr>
+                  <m:sty m:val="p"/>
+                </m:rPr>
+                <m:t xml:space="preserve">L</m:t>
+              </m:r>
+            </m:den>
+          </m:f>
+        </m:oMath>
+      </m:oMathPara>
+    </w:p>
+    <w:p>
+      <w:pPr>
+        <w:spacing w:after="40"/>
+        <w:jc w:val="center"/>
+      </w:pPr>
+      <w:r>
+        <w:rPr>
+          <w:rFonts w:ascii="Microsoft YaHei" w:hAnsi="Microsoft YaHei" w:eastAsia="Microsoft YaHei"/>
+          <w:b w:val="0"/>
+          <w:i/>
+          <w:color w:val="667085"/>
+          <w:sz w:val="21"/>
+        </w:rPr>
+        <w:t>Ziegler-Nichols 积分参数</w:t>
+      </w:r>
+    </w:p>
+    <w:p>
+      <w:pPr>
+        <w:spacing w:before="60" w:after="160"/>
+        <w:jc w:val="center"/>
+      </w:pPr>
+      <m:oMathPara>
+        <m:oMath>
+          <m:r>
+            <m:rPr>
+              <m:sty m:val="p"/>
+            </m:rPr>
+            <m:t xml:space="preserve">T</m:t>
+          </m:r>
+          <m:sSub>
+            <m:e>
+              <m:r>
+                <m:rPr>
+                  <m:sty m:val="p"/>
+                </m:rPr>
+                <m:t xml:space="preserve">i</m:t>
+              </m:r>
+            </m:e>
+            <m:sub>
+              <m:r>
+                <m:rPr>
+                  <m:sty m:val="p"/>
+                </m:rPr>
+                <m:t xml:space="preserve">ZN</m:t>
+              </m:r>
+            </m:sub>
+          </m:sSub>
+          <m:r>
+            <m:rPr>
+              <m:sty m:val="p"/>
+            </m:rPr>
+            <m:t xml:space="preserve"> = 3.33L；  </m:t>
+          </m:r>
+          <m:sSup>
+            <m:e>
+              <m:sSub>
+                <m:e>
+                  <m:r>
+                    <m:rPr>
+                      <m:sty m:val="p"/>
+                    </m:rPr>
+                    <m:t xml:space="preserve">K</m:t>
+                  </m:r>
+                </m:e>
+                <m:sub>
+                  <m:r>
+                    <m:rPr>
+                      <m:sty m:val="p"/>
+                    </m:rPr>
+                    <m:t xml:space="preserve">i</m:t>
+                  </m:r>
+                </m:sub>
+              </m:sSub>
+            </m:e>
+            <m:sup>
+              <m:r>
+                <m:rPr>
+                  <m:sty m:val="p"/>
+                </m:rPr>
+                <m:t xml:space="preserve">ZN</m:t>
+              </m:r>
+            </m:sup>
+          </m:sSup>
+          <m:r>
+            <m:rPr>
+              <m:sty m:val="p"/>
+            </m:rPr>
+            <m:t xml:space="preserve"> = </m:t>
+          </m:r>
+          <m:f>
+            <m:num>
+              <m:sSup>
+                <m:e>
+                  <m:sSub>
+                    <m:e>
+                      <m:r>
+                        <m:rPr>
+                          <m:sty m:val="p"/>
+                        </m:rPr>
+                        <m:t xml:space="preserve">K</m:t>
+                      </m:r>
+                    </m:e>
+                    <m:sub>
+                      <m:r>
+                        <m:rPr>
+                          <m:sty m:val="p"/>
+                        </m:rPr>
+                        <m:t xml:space="preserve">p</m:t>
+                      </m:r>
+                    </m:sub>
+                  </m:sSub>
+                </m:e>
+                <m:sup>
+                  <m:r>
+                    <m:rPr>
+                      <m:sty m:val="p"/>
+                    </m:rPr>
+                    <m:t xml:space="preserve">ZN</m:t>
+                  </m:r>
+                </m:sup>
+              </m:sSup>
+            </m:num>
+            <m:den>
+              <m:r>
+                <m:rPr>
+                  <m:sty m:val="p"/>
+                </m:rPr>
+                <m:t xml:space="preserve">T</m:t>
+              </m:r>
+              <m:sSub>
+                <m:e>
+                  <m:r>
+                    <m:rPr>
+                      <m:sty m:val="p"/>
+                    </m:rPr>
+                    <m:t xml:space="preserve">i</m:t>
+                  </m:r>
+                </m:e>
+                <m:sub>
+                  <m:r>
+                    <m:rPr>
+                      <m:sty m:val="p"/>
+                    </m:rPr>
+                    <m:t xml:space="preserve">ZN</m:t>
+                  </m:r>
+                </m:sub>
+              </m:sSub>
+            </m:den>
+          </m:f>
+        </m:oMath>
+      </m:oMathPara>
+    </w:p>
+    <w:p>
+      <w:pPr>
+        <w:spacing w:after="40"/>
+        <w:jc w:val="center"/>
+      </w:pPr>
+      <w:r>
+        <w:rPr>
+          <w:rFonts w:ascii="Microsoft YaHei" w:hAnsi="Microsoft YaHei" w:eastAsia="Microsoft YaHei"/>
+          <w:b w:val="0"/>
+          <w:i/>
+          <w:color w:val="667085"/>
+          <w:sz w:val="21"/>
+        </w:rPr>
+        <w:t>IMC 闭环速度与比例增益</w:t>
+      </w:r>
+    </w:p>
+    <w:p>
+      <w:pPr>
+        <w:spacing w:before="60" w:after="160"/>
+        <w:jc w:val="center"/>
+      </w:pPr>
+      <m:oMathPara>
+        <m:oMath>
+          <m:r>
+            <m:rPr>
+              <m:sty m:val="p"/>
+            </m:rPr>
+            <m:t xml:space="preserve">λ = max(τ/3, 3L, 12 min)；  </m:t>
+          </m:r>
+          <m:sSup>
+            <m:e>
+              <m:sSub>
+                <m:e>
+                  <m:r>
+                    <m:rPr>
+                      <m:sty m:val="p"/>
+                    </m:rPr>
+                    <m:t xml:space="preserve">K</m:t>
+                  </m:r>
+                </m:e>
+                <m:sub>
+                  <m:r>
+                    <m:rPr>
+                      <m:sty m:val="p"/>
+                    </m:rPr>
+                    <m:t xml:space="preserve">p</m:t>
+                  </m:r>
+                </m:sub>
+              </m:sSub>
+            </m:e>
+            <m:sup>
+              <m:r>
+                <m:rPr>
+                  <m:sty m:val="p"/>
+                </m:rPr>
+                <m:t xml:space="preserve">IMC</m:t>
+              </m:r>
+            </m:sup>
+          </m:sSup>
+          <m:r>
+            <m:rPr>
+              <m:sty m:val="p"/>
+            </m:rPr>
+            <m:t xml:space="preserve"> = </m:t>
+          </m:r>
+          <m:f>
+            <m:num>
+              <m:r>
+                <m:rPr>
+                  <m:sty m:val="p"/>
+                </m:rPr>
+                <m:t xml:space="preserve">τ</m:t>
+              </m:r>
+            </m:num>
+            <m:den>
+              <m:r>
+                <m:rPr>
+                  <m:sty m:val="p"/>
+                </m:rPr>
+                <m:t xml:space="preserve">K</m:t>
+              </m:r>
+              <m:r>
+                <m:rPr>
+                  <m:sty m:val="p"/>
+                </m:rPr>
+                <m:t xml:space="preserve">(</m:t>
+              </m:r>
+              <m:r>
+                <m:rPr>
+                  <m:sty m:val="p"/>
+                </m:rPr>
+                <m:t xml:space="preserve">λ</m:t>
+              </m:r>
+              <m:r>
+                <m:rPr>
+                  <m:sty m:val="p"/>
+                </m:rPr>
+                <m:t xml:space="preserve">+</m:t>
+              </m:r>
+              <m:r>
+                <m:rPr>
+                  <m:sty m:val="p"/>
+                </m:rPr>
+                <m:t xml:space="preserve">L</m:t>
+              </m:r>
+              <m:r>
+                <m:rPr>
+                  <m:sty m:val="p"/>
+                </m:rPr>
+                <m:t xml:space="preserve">)</m:t>
+              </m:r>
+            </m:den>
+          </m:f>
+        </m:oMath>
+      </m:oMathPara>
+    </w:p>
+    <w:p>
+      <w:pPr>
+        <w:spacing w:after="40"/>
+        <w:jc w:val="center"/>
+      </w:pPr>
+      <w:r>
+        <w:rPr>
+          <w:rFonts w:ascii="Microsoft YaHei" w:hAnsi="Microsoft YaHei" w:eastAsia="Microsoft YaHei"/>
+          <w:b w:val="0"/>
+          <w:i/>
+          <w:color w:val="667085"/>
+          <w:sz w:val="21"/>
+        </w:rPr>
+        <w:t>IMC 积分参数</w:t>
+      </w:r>
+    </w:p>
+    <w:p>
+      <w:pPr>
+        <w:spacing w:before="60" w:after="160"/>
+        <w:jc w:val="center"/>
+      </w:pPr>
+      <m:oMathPara>
+        <m:oMath>
+          <m:r>
+            <m:rPr>
+              <m:sty m:val="p"/>
+            </m:rPr>
+            <m:t xml:space="preserve">T</m:t>
+          </m:r>
+          <m:sSub>
+            <m:e>
+              <m:r>
+                <m:rPr>
+                  <m:sty m:val="p"/>
+                </m:rPr>
+                <m:t xml:space="preserve">i</m:t>
+              </m:r>
+            </m:e>
+            <m:sub>
+              <m:r>
+                <m:rPr>
+                  <m:sty m:val="p"/>
+                </m:rPr>
+                <m:t xml:space="preserve">IMC</m:t>
+              </m:r>
+            </m:sub>
+          </m:sSub>
+          <m:r>
+            <m:rPr>
+              <m:sty m:val="p"/>
+            </m:rPr>
+            <m:t xml:space="preserve"> = min[τ, 4(λ+L)]；  </m:t>
+          </m:r>
+          <m:sSup>
+            <m:e>
+              <m:sSub>
+                <m:e>
+                  <m:r>
+                    <m:rPr>
+                      <m:sty m:val="p"/>
+                    </m:rPr>
+                    <m:t xml:space="preserve">K</m:t>
+                  </m:r>
+                </m:e>
+                <m:sub>
+                  <m:r>
+                    <m:rPr>
+                      <m:sty m:val="p"/>
+                    </m:rPr>
+                    <m:t xml:space="preserve">i</m:t>
+                  </m:r>
+                </m:sub>
+              </m:sSub>
+            </m:e>
+            <m:sup>
+              <m:r>
+                <m:rPr>
+                  <m:sty m:val="p"/>
+                </m:rPr>
+                <m:t xml:space="preserve">IMC</m:t>
+              </m:r>
+            </m:sup>
+          </m:sSup>
+          <m:r>
+            <m:rPr>
+              <m:sty m:val="p"/>
+            </m:rPr>
+            <m:t xml:space="preserve"> = </m:t>
+          </m:r>
+          <m:f>
+            <m:num>
+              <m:sSup>
+                <m:e>
+                  <m:sSub>
+                    <m:e>
+                      <m:r>
+                        <m:rPr>
+                          <m:sty m:val="p"/>
+                        </m:rPr>
+                        <m:t xml:space="preserve">K</m:t>
+                      </m:r>
+                    </m:e>
+                    <m:sub>
+                      <m:r>
+                        <m:rPr>
+                          <m:sty m:val="p"/>
+                        </m:rPr>
+                        <m:t xml:space="preserve">p</m:t>
+                      </m:r>
+                    </m:sub>
+                  </m:sSub>
+                </m:e>
+                <m:sup>
+                  <m:r>
+                    <m:rPr>
+                      <m:sty m:val="p"/>
+                    </m:rPr>
+                    <m:t xml:space="preserve">IMC</m:t>
+                  </m:r>
+                </m:sup>
+              </m:sSup>
+            </m:num>
+            <m:den>
+              <m:r>
+                <m:rPr>
+                  <m:sty m:val="p"/>
+                </m:rPr>
+                <m:t xml:space="preserve">T</m:t>
+              </m:r>
+              <m:sSub>
+                <m:e>
+                  <m:r>
+                    <m:rPr>
+                      <m:sty m:val="p"/>
+                    </m:rPr>
+                    <m:t xml:space="preserve">i</m:t>
+                  </m:r>
+                </m:e>
+                <m:sub>
+                  <m:r>
+                    <m:rPr>
+                      <m:sty m:val="p"/>
+                    </m:rPr>
+                    <m:t xml:space="preserve">IMC</m:t>
+                  </m:r>
+                </m:sub>
+              </m:sSub>
+            </m:den>
+          </m:f>
+        </m:oMath>
+      </m:oMathPara>
     </w:p>
     <w:tbl>
       <w:tblPr>
@@ -3457,7 +4792,7 @@
     </w:p>
     <w:p>
       <w:pPr>
-        <w:spacing w:after="60"/>
+        <w:spacing w:after="40"/>
         <w:jc w:val="center"/>
       </w:pPr>
       <w:r>
@@ -3468,95 +4803,138 @@
           <w:color w:val="667085"/>
           <w:sz w:val="21"/>
         </w:rPr>
-        <w:t>统一评价目标</w:t>
+        <w:t>统一评价目标：J 越小越好</w:t>
       </w:r>
     </w:p>
-    <w:tbl>
-      <w:tblPr>
-        <w:tblW w:type="dxa" w:w="9360"/>
-        <w:tblLayout w:type="fixed"/>
-        <w:tblLook w:firstColumn="1" w:firstRow="1" w:lastColumn="0" w:lastRow="0" w:noHBand="0" w:noVBand="1" w:val="04A0"/>
-        <w:jc w:val="left"/>
-        <w:tblInd w:w="120" w:type="dxa"/>
-      </w:tblPr>
-      <w:tblGrid>
-        <w:gridCol w:w="9360"/>
-      </w:tblGrid>
-      <w:tr>
-        <w:tc>
-          <w:tcPr>
-            <w:tcW w:type="dxa" w:w="9360"/>
-            <w:tcMar>
-              <w:top w:w="80" w:type="dxa"/>
-              <w:start w:w="120" w:type="dxa"/>
-              <w:bottom w:w="80" w:type="dxa"/>
-              <w:end w:w="120" w:type="dxa"/>
-            </w:tcMar>
-            <w:vAlign w:val="center"/>
-            <w:shd w:fill="F7F8FA"/>
-          </w:tcPr>
-          <w:p>
-            <w:pPr>
-              <w:spacing w:after="0" w:line="240" w:lineRule="auto"/>
-            </w:pPr>
-            <w:r/>
-            <w:r>
-              <w:rPr>
-                <w:rFonts w:ascii="Consolas" w:hAnsi="Consolas" w:eastAsia="Consolas"/>
-                <w:b w:val="0"/>
-                <w:i w:val="0"/>
-                <w:color w:val="263238"/>
-                <w:sz w:val="16"/>
-              </w:rPr>
-              <w:t>objective=2*IAE+1.5*ITAE+10*comfort_violation</w:t>
-            </w:r>
-            <w:r>
-              <w:br/>
-            </w:r>
-            <w:r>
-              <w:rPr>
-                <w:rFonts w:ascii="Consolas" w:hAnsi="Consolas" w:eastAsia="Consolas"/>
-                <w:b w:val="0"/>
-                <w:i w:val="0"/>
-                <w:color w:val="263238"/>
-                <w:sz w:val="16"/>
-              </w:rPr>
-              <w:t xml:space="preserve">         +3*max_undershoot+0.35*settling_time</w:t>
-            </w:r>
-            <w:r>
-              <w:br/>
-            </w:r>
-            <w:r>
-              <w:rPr>
-                <w:rFonts w:ascii="Consolas" w:hAnsi="Consolas" w:eastAsia="Consolas"/>
-                <w:b w:val="0"/>
-                <w:i w:val="0"/>
-                <w:color w:val="263238"/>
-                <w:sz w:val="16"/>
-              </w:rPr>
-              <w:t xml:space="preserve">         +0.08*control_movement+0.7*command_variance</w:t>
-            </w:r>
-            <w:r>
-              <w:br/>
-            </w:r>
-            <w:r>
-              <w:rPr>
-                <w:rFonts w:ascii="Consolas" w:hAnsi="Consolas" w:eastAsia="Consolas"/>
-                <w:b w:val="0"/>
-                <w:i w:val="0"/>
-                <w:color w:val="263238"/>
-                <w:sz w:val="16"/>
-              </w:rPr>
-              <w:t xml:space="preserve">         +0.015*cooling_energy</w:t>
-            </w:r>
-          </w:p>
-        </w:tc>
-      </w:tr>
-    </w:tbl>
     <w:p>
       <w:pPr>
-        <w:spacing w:after="40"/>
+        <w:spacing w:before="60" w:after="160"/>
+        <w:jc w:val="center"/>
       </w:pPr>
+      <m:oMathPara>
+        <m:oMath>
+          <m:r>
+            <m:rPr>
+              <m:sty m:val="p"/>
+            </m:rPr>
+            <m:t xml:space="preserve">J = 2·IAE + 1.5·ITAE + 10·</m:t>
+          </m:r>
+          <m:sSub>
+            <m:e>
+              <m:r>
+                <m:rPr>
+                  <m:sty m:val="p"/>
+                </m:rPr>
+                <m:t xml:space="preserve">V</m:t>
+              </m:r>
+            </m:e>
+            <m:sub>
+              <m:r>
+                <m:rPr>
+                  <m:sty m:val="p"/>
+                </m:rPr>
+                <m:t xml:space="preserve">comfort</m:t>
+              </m:r>
+            </m:sub>
+          </m:sSub>
+          <m:r>
+            <m:rPr>
+              <m:sty m:val="p"/>
+            </m:rPr>
+            <m:t xml:space="preserve"> + 3·</m:t>
+          </m:r>
+          <m:sSub>
+            <m:e>
+              <m:r>
+                <m:rPr>
+                  <m:sty m:val="p"/>
+                </m:rPr>
+                <m:t xml:space="preserve">ΔT</m:t>
+              </m:r>
+            </m:e>
+            <m:sub>
+              <m:r>
+                <m:rPr>
+                  <m:sty m:val="p"/>
+                </m:rPr>
+                <m:t xml:space="preserve">under</m:t>
+              </m:r>
+            </m:sub>
+          </m:sSub>
+          <m:r>
+            <m:rPr>
+              <m:sty m:val="p"/>
+            </m:rPr>
+            <m:t xml:space="preserve"> + 0.35·</m:t>
+          </m:r>
+          <m:sSub>
+            <m:e>
+              <m:r>
+                <m:rPr>
+                  <m:sty m:val="p"/>
+                </m:rPr>
+                <m:t xml:space="preserve">t</m:t>
+              </m:r>
+            </m:e>
+            <m:sub>
+              <m:r>
+                <m:rPr>
+                  <m:sty m:val="p"/>
+                </m:rPr>
+                <m:t xml:space="preserve">settle</m:t>
+              </m:r>
+            </m:sub>
+          </m:sSub>
+          <m:r>
+            <m:rPr>
+              <m:sty m:val="p"/>
+            </m:rPr>
+            <m:t xml:space="preserve"> + 0.08·</m:t>
+          </m:r>
+          <m:sSub>
+            <m:e>
+              <m:r>
+                <m:rPr>
+                  <m:sty m:val="p"/>
+                </m:rPr>
+                <m:t xml:space="preserve">M</m:t>
+              </m:r>
+            </m:e>
+            <m:sub>
+              <m:r>
+                <m:rPr>
+                  <m:sty m:val="p"/>
+                </m:rPr>
+                <m:t xml:space="preserve">u</m:t>
+              </m:r>
+            </m:sub>
+          </m:sSub>
+          <m:r>
+            <m:rPr>
+              <m:sty m:val="p"/>
+            </m:rPr>
+            <m:t xml:space="preserve"> + 0.7·Var(u) + 0.015·</m:t>
+          </m:r>
+          <m:sSub>
+            <m:e>
+              <m:r>
+                <m:rPr>
+                  <m:sty m:val="p"/>
+                </m:rPr>
+                <m:t xml:space="preserve">E</m:t>
+              </m:r>
+            </m:e>
+            <m:sub>
+              <m:r>
+                <m:rPr>
+                  <m:sty m:val="p"/>
+                </m:rPr>
+                <m:t xml:space="preserve">cool</m:t>
+              </m:r>
+            </m:sub>
+          </m:sSub>
+        </m:oMath>
+      </m:oMathPara>
     </w:p>
     <w:p>
       <w:pPr>
@@ -7514,6 +8892,182 @@
     </w:p>
     <w:p>
       <w:pPr>
+        <w:spacing w:after="40"/>
+        <w:jc w:val="center"/>
+      </w:pPr>
+      <w:r>
+        <w:rPr>
+          <w:rFonts w:ascii="Microsoft YaHei" w:hAnsi="Microsoft YaHei" w:eastAsia="Microsoft YaHei"/>
+          <w:b w:val="0"/>
+          <w:i/>
+          <w:color w:val="667085"/>
+          <w:sz w:val="21"/>
+        </w:rPr>
+        <w:t>FNN 双线性插值：只激活相邻4条规则</w:t>
+      </w:r>
+    </w:p>
+    <w:p>
+      <w:pPr>
+        <w:spacing w:before="60" w:after="160"/>
+        <w:jc w:val="center"/>
+      </w:pPr>
+      <m:oMathPara>
+        <m:oMath>
+          <m:sSub>
+            <m:e>
+              <m:r>
+                <m:rPr>
+                  <m:sty m:val="p"/>
+                </m:rPr>
+                <m:t xml:space="preserve">K</m:t>
+              </m:r>
+            </m:e>
+            <m:sub>
+              <m:r>
+                <m:rPr>
+                  <m:sty m:val="p"/>
+                </m:rPr>
+                <m:t xml:space="preserve">p</m:t>
+              </m:r>
+            </m:sub>
+          </m:sSub>
+          <m:r>
+            <m:rPr>
+              <m:sty m:val="p"/>
+            </m:rPr>
+            <m:t xml:space="preserve"> = Σ</m:t>
+          </m:r>
+          <m:sSub>
+            <m:e>
+              <m:r>
+                <m:rPr>
+                  <m:sty m:val="p"/>
+                </m:rPr>
+                <m:t xml:space="preserve">i,j</m:t>
+              </m:r>
+            </m:e>
+            <m:sub>
+              <m:r>
+                <m:rPr>
+                  <m:sty m:val="p"/>
+                </m:rPr>
+                <m:t xml:space="preserve">N(e,Δe)</m:t>
+              </m:r>
+            </m:sub>
+          </m:sSub>
+          <m:r>
+            <m:rPr>
+              <m:sty m:val="p"/>
+            </m:rPr>
+            <m:t xml:space="preserve"> w</m:t>
+          </m:r>
+          <m:sSub>
+            <m:e>
+              <m:r>
+                <m:rPr>
+                  <m:sty m:val="p"/>
+                </m:rPr>
+                <m:t xml:space="preserve">ij</m:t>
+              </m:r>
+            </m:e>
+            <m:sub>
+              <m:r>
+                <m:rPr>
+                  <m:sty m:val="p"/>
+                </m:rPr>
+                <m:t xml:space="preserve"/>
+              </m:r>
+            </m:sub>
+          </m:sSub>
+          <m:sSub>
+            <m:e>
+              <m:r>
+                <m:rPr>
+                  <m:sty m:val="p"/>
+                </m:rPr>
+                <m:t xml:space="preserve">K</m:t>
+              </m:r>
+            </m:e>
+            <m:sub>
+              <m:r>
+                <m:rPr>
+                  <m:sty m:val="p"/>
+                </m:rPr>
+                <m:t xml:space="preserve">p,ij</m:t>
+              </m:r>
+            </m:sub>
+          </m:sSub>
+          <m:r>
+            <m:rPr>
+              <m:sty m:val="p"/>
+            </m:rPr>
+            <m:t xml:space="preserve">；  </m:t>
+          </m:r>
+          <m:sSub>
+            <m:e>
+              <m:r>
+                <m:rPr>
+                  <m:sty m:val="p"/>
+                </m:rPr>
+                <m:t xml:space="preserve">K</m:t>
+              </m:r>
+            </m:e>
+            <m:sub>
+              <m:r>
+                <m:rPr>
+                  <m:sty m:val="p"/>
+                </m:rPr>
+                <m:t xml:space="preserve">i</m:t>
+              </m:r>
+            </m:sub>
+          </m:sSub>
+          <m:r>
+            <m:rPr>
+              <m:sty m:val="p"/>
+            </m:rPr>
+            <m:t xml:space="preserve"> = Σ w</m:t>
+          </m:r>
+          <m:sSub>
+            <m:e>
+              <m:r>
+                <m:rPr>
+                  <m:sty m:val="p"/>
+                </m:rPr>
+                <m:t xml:space="preserve">ij</m:t>
+              </m:r>
+            </m:e>
+            <m:sub>
+              <m:r>
+                <m:rPr>
+                  <m:sty m:val="p"/>
+                </m:rPr>
+                <m:t xml:space="preserve"/>
+              </m:r>
+            </m:sub>
+          </m:sSub>
+          <m:sSub>
+            <m:e>
+              <m:r>
+                <m:rPr>
+                  <m:sty m:val="p"/>
+                </m:rPr>
+                <m:t xml:space="preserve">K</m:t>
+              </m:r>
+            </m:e>
+            <m:sub>
+              <m:r>
+                <m:rPr>
+                  <m:sty m:val="p"/>
+                </m:rPr>
+                <m:t xml:space="preserve">i,ij</m:t>
+              </m:r>
+            </m:sub>
+          </m:sSub>
+        </m:oMath>
+      </m:oMathPara>
+    </w:p>
+    <w:p>
+      <w:pPr>
         <w:spacing w:after="60"/>
         <w:jc w:val="center"/>
       </w:pPr>
@@ -16863,6 +18417,142 @@
         </w:rPr>
         <w:t>回合结束记录reward、20回合均值、TD、覆盖率、策略变化和Kp/Ki；500回合后冻结argmax。</w:t>
       </w:r>
+    </w:p>
+    <w:p>
+      <w:pPr>
+        <w:spacing w:after="40"/>
+        <w:jc w:val="center"/>
+      </w:pPr>
+      <w:r>
+        <w:rPr>
+          <w:rFonts w:ascii="Microsoft YaHei" w:hAnsi="Microsoft YaHei" w:eastAsia="Microsoft YaHei"/>
+          <w:b w:val="0"/>
+          <w:i/>
+          <w:color w:val="667085"/>
+          <w:sz w:val="21"/>
+        </w:rPr>
+        <w:t>RL 即时奖励</w:t>
+      </w:r>
+    </w:p>
+    <w:p>
+      <w:pPr>
+        <w:spacing w:before="60" w:after="160"/>
+        <w:jc w:val="center"/>
+      </w:pPr>
+      <m:oMathPara>
+        <m:oMath>
+          <m:r>
+            <m:rPr>
+              <m:sty m:val="p"/>
+            </m:rPr>
+            <m:t xml:space="preserve">r = −|e'| − 0.18·</m:t>
+          </m:r>
+          <m:sSub>
+            <m:e>
+              <m:r>
+                <m:rPr>
+                  <m:sty m:val="p"/>
+                </m:rPr>
+                <m:t xml:space="preserve">||a||</m:t>
+              </m:r>
+            </m:e>
+            <m:sub>
+              <m:r>
+                <m:rPr>
+                  <m:sty m:val="p"/>
+                </m:rPr>
+                <m:t xml:space="preserve">1</m:t>
+              </m:r>
+            </m:sub>
+          </m:sSub>
+          <m:r>
+            <m:rPr>
+              <m:sty m:val="p"/>
+            </m:rPr>
+            <m:t xml:space="preserve"> − 0.04|</m:t>
+          </m:r>
+          <m:sSub>
+            <m:e>
+              <m:r>
+                <m:rPr>
+                  <m:sty m:val="p"/>
+                </m:rPr>
+                <m:t xml:space="preserve">s</m:t>
+              </m:r>
+            </m:e>
+            <m:sub>
+              <m:r>
+                <m:rPr>
+                  <m:sty m:val="p"/>
+                </m:rPr>
+                <m:t xml:space="preserve">p</m:t>
+              </m:r>
+            </m:sub>
+          </m:sSub>
+          <m:r>
+            <m:rPr>
+              <m:sty m:val="p"/>
+            </m:rPr>
+            <m:t xml:space="preserve">−1| − 0.03u</m:t>
+          </m:r>
+        </m:oMath>
+      </m:oMathPara>
+    </w:p>
+    <w:p>
+      <w:pPr>
+        <w:spacing w:after="40"/>
+        <w:jc w:val="center"/>
+      </w:pPr>
+      <w:r>
+        <w:rPr>
+          <w:rFonts w:ascii="Microsoft YaHei" w:hAnsi="Microsoft YaHei" w:eastAsia="Microsoft YaHei"/>
+          <w:b w:val="0"/>
+          <w:i/>
+          <w:color w:val="667085"/>
+          <w:sz w:val="21"/>
+        </w:rPr>
+        <w:t>RL TD 目标与 Q-learning 更新</w:t>
+      </w:r>
+    </w:p>
+    <w:p>
+      <w:pPr>
+        <w:spacing w:before="60" w:after="160"/>
+        <w:jc w:val="center"/>
+      </w:pPr>
+      <m:oMathPara>
+        <m:oMath>
+          <m:r>
+            <m:rPr>
+              <m:sty m:val="p"/>
+            </m:rPr>
+            <m:t xml:space="preserve">target = r + γ </m:t>
+          </m:r>
+          <m:sSub>
+            <m:e>
+              <m:r>
+                <m:rPr>
+                  <m:sty m:val="p"/>
+                </m:rPr>
+                <m:t xml:space="preserve">max</m:t>
+              </m:r>
+            </m:e>
+            <m:sub>
+              <m:r>
+                <m:rPr>
+                  <m:sty m:val="p"/>
+                </m:rPr>
+                <m:t xml:space="preserve">a</m:t>
+              </m:r>
+            </m:sub>
+          </m:sSub>
+          <m:r>
+            <m:rPr>
+              <m:sty m:val="p"/>
+            </m:rPr>
+            <m:t xml:space="preserve"> Q(s',a)；  Q(s,a) ← Q(s,a) + α[target − Q(s,a)]</m:t>
+          </m:r>
+        </m:oMath>
+      </m:oMathPara>
     </w:p>
     <w:p>
       <w:pPr>

</xml_diff>